<commit_message>
Add universal kiosk poster drafts and update build script
- Created two HTML templates for A0 posters: 'poster_a.html' and 'poster_b.html' for different design approaches.
- Updated 'build_poster.py' to support generating drafts for the new poster designs.
- Added functionality to print posters in Gulim font for better accessibility.
- Included new PDF files for the generated posters: '포스터_시안A_NO PROBLEM KIOSK_A0.pdf', '포스터_시안B_NO PROBLEM KIOSK_A0.pdf', and '포스터_시안B_굴림체_NO PROBLEM KIOSK_A0.pdf'.
- Added a new PDF file for the project poster: '작품포스터_NO PROBLEM KIOSK.pdf'.
</commit_message>
<xml_diff>
--- a/[서식2]작품설명서_NO PROBLEM KIOSK.docx
+++ b/[서식2]작품설명서_NO PROBLEM KIOSK.docx
@@ -231,15 +231,14 @@
         <w:rPr>
           <w:color w:val="000000"/>
           <w:sz w:val="24"/>
-          <w:szCs w:val="24"/>
-        </w:rPr>
-      </w:pPr>
-      <w:r>
-        <w:rPr>
-          <w:color w:val="000000"/>
-          <w:sz w:val="24"/>
-        </w:rPr>
-        <w:t>첫째, 키가 작은 어린이는 화면 위쪽에 있는 버튼에 손이 닿지 않습니다. 발끝을 들고 겨우 누르거나, 결국 어른이 대신 눌러 주어야 합니다. 둘째, 할머니·할아버지께서는 글씨가 너무 작고 단계가 복잡해서 '뭘 눌러야 하는지 모르겠다'며 한참을 헤매시다가 뒤에 줄이 길어지면 미안해하며 포기하시기도 합니다.</w:t>
+        </w:rPr>
+      </w:pPr>
+      <w:r>
+        <w:rPr>
+          <w:color w:val="000000"/>
+          <w:sz w:val="24"/>
+        </w:rPr>
+        <w:t xml:space="preserve">첫째, 키가 작은 어린이는 화면 위쪽에 있는 버튼에 손이 닿지 않습니다. 발끝을 들고 겨우 누르거나, 결국 어른이 대신 눌러 주어야 합니다. </w:t>
       </w:r>
     </w:p>
     <w:p>
@@ -261,11 +260,36 @@
       </w:pPr>
       <w:r>
         <w:rPr>
+          <w:color w:val="000000"/>
+          <w:sz w:val="24"/>
+        </w:rPr>
+        <w:t>둘째, 할머니·할아버지께서는 글씨가 너무 작고 단계가 복잡해서 '뭘 눌러야 하는지 모르겠다'며 한참을 헤매시다가 뒤에 줄이 길어지면 미안해하며 포기하시기도 합니다.</w:t>
+      </w:r>
+    </w:p>
+    <w:p>
+      <w:pPr>
+        <w:pBdr>
+          <w:top w:val="none" w:sz="0" w:space="0" w:color="000000"/>
+          <w:left w:val="none" w:sz="0" w:space="0" w:color="000000"/>
+          <w:bottom w:val="none" w:sz="0" w:space="0" w:color="000000"/>
+          <w:right w:val="none" w:sz="0" w:space="0" w:color="000000"/>
+          <w:between w:val="nil"/>
+        </w:pBdr>
+        <w:spacing w:after="120" w:line="264" w:lineRule="auto"/>
+        <w:ind w:left="420"/>
+        <w:rPr>
+          <w:color w:val="000000"/>
+          <w:sz w:val="24"/>
+          <w:szCs w:val="24"/>
+        </w:rPr>
+      </w:pPr>
+      <w:r>
+        <w:rPr>
           <w:rFonts w:hint="eastAsia"/>
           <w:color w:val="000000"/>
           <w:sz w:val="24"/>
         </w:rPr>
-        <w:t>둘</w:t>
+        <w:t>셋</w:t>
       </w:r>
       <w:r>
         <w:rPr>

</xml_diff>